<commit_message>
wMKL re-run; consensus and comparisons update
</commit_message>
<xml_diff>
--- a/Results/Consensus/CC/TABLE Independent test between subtype and mutation.docx
+++ b/Results/Consensus/CC/TABLE Independent test between subtype and mutation.docx
@@ -110,37 +110,37 @@
               <w:pStyle w:stlname="Normal" w:val="Normal"/>
             </w:pPr>
             <w:r>
-              <w:t>27 (5.4%)</w:t>
-            </w:r>
-          </w:p>
-        </w:tc>
-        <w:tc>
-          <w:p>
-            <w:pPr>
-              <w:pStyle w:stlname="Normal" w:val="Normal"/>
-            </w:pPr>
-            <w:r>
-              <w:t>11 (8.5%)</w:t>
-            </w:r>
-          </w:p>
-        </w:tc>
-        <w:tc>
-          <w:p>
-            <w:pPr>
-              <w:pStyle w:stlname="Normal" w:val="Normal"/>
-            </w:pPr>
-            <w:r>
-              <w:t>2.72e-01</w:t>
-            </w:r>
-          </w:p>
-        </w:tc>
-        <w:tc>
-          <w:p>
-            <w:pPr>
-              <w:pStyle w:stlname="Normal" w:val="Normal"/>
-            </w:pPr>
-            <w:r>
-              <w:t>3.89e-01</w:t>
+              <w:t>26 (5.3%)</w:t>
+            </w:r>
+          </w:p>
+        </w:tc>
+        <w:tc>
+          <w:p>
+            <w:pPr>
+              <w:pStyle w:stlname="Normal" w:val="Normal"/>
+            </w:pPr>
+            <w:r>
+              <w:t>12 (9.2%)</w:t>
+            </w:r>
+          </w:p>
+        </w:tc>
+        <w:tc>
+          <w:p>
+            <w:pPr>
+              <w:pStyle w:stlname="Normal" w:val="Normal"/>
+            </w:pPr>
+            <w:r>
+              <w:t>1.38e-01</w:t>
+            </w:r>
+          </w:p>
+        </w:tc>
+        <w:tc>
+          <w:p>
+            <w:pPr>
+              <w:pStyle w:stlname="Normal" w:val="Normal"/>
+            </w:pPr>
+            <w:r>
+              <w:t>2.30e-01</w:t>
             </w:r>
           </w:p>
         </w:tc>
@@ -172,37 +172,37 @@
               <w:pStyle w:stlname="Normal" w:val="Normal"/>
             </w:pPr>
             <w:r>
-              <w:t>84 (16.9%)</w:t>
-            </w:r>
-          </w:p>
-        </w:tc>
-        <w:tc>
-          <w:p>
-            <w:pPr>
-              <w:pStyle w:stlname="Normal" w:val="Normal"/>
-            </w:pPr>
-            <w:r>
-              <w:t>87 (67.4%)</w:t>
-            </w:r>
-          </w:p>
-        </w:tc>
-        <w:tc>
-          <w:p>
-            <w:pPr>
-              <w:pStyle w:stlname="Normal" w:val="Normal"/>
-            </w:pPr>
-            <w:r>
-              <w:t>7.24e-30</w:t>
-            </w:r>
-          </w:p>
-        </w:tc>
-        <w:tc>
-          <w:p>
-            <w:pPr>
-              <w:pStyle w:stlname="Normal" w:val="Normal"/>
-            </w:pPr>
-            <w:r>
-              <w:t>7.24e-29</w:t>
+              <w:t>83 (16.8%)</w:t>
+            </w:r>
+          </w:p>
+        </w:tc>
+        <w:tc>
+          <w:p>
+            <w:pPr>
+              <w:pStyle w:stlname="Normal" w:val="Normal"/>
+            </w:pPr>
+            <w:r>
+              <w:t>88 (67.7%)</w:t>
+            </w:r>
+          </w:p>
+        </w:tc>
+        <w:tc>
+          <w:p>
+            <w:pPr>
+              <w:pStyle w:stlname="Normal" w:val="Normal"/>
+            </w:pPr>
+            <w:r>
+              <w:t>1.66e-30</w:t>
+            </w:r>
+          </w:p>
+        </w:tc>
+        <w:tc>
+          <w:p>
+            <w:pPr>
+              <w:pStyle w:stlname="Normal" w:val="Normal"/>
+            </w:pPr>
+            <w:r>
+              <w:t>1.66e-29</w:t>
             </w:r>
           </w:p>
         </w:tc>
@@ -234,7 +234,7 @@
               <w:pStyle w:stlname="Normal" w:val="Normal"/>
             </w:pPr>
             <w:r>
-              <w:t>197 (39.7%)</w:t>
+              <w:t>197 (39.8%)</w:t>
             </w:r>
           </w:p>
         </w:tc>
@@ -254,17 +254,17 @@
               <w:pStyle w:stlname="Normal" w:val="Normal"/>
             </w:pPr>
             <w:r>
-              <w:t>1.10e-12</w:t>
-            </w:r>
-          </w:p>
-        </w:tc>
-        <w:tc>
-          <w:p>
-            <w:pPr>
-              <w:pStyle w:stlname="Normal" w:val="Normal"/>
-            </w:pPr>
-            <w:r>
-              <w:t>5.50e-12</w:t>
+              <w:t>7.69e-13</w:t>
+            </w:r>
+          </w:p>
+        </w:tc>
+        <w:tc>
+          <w:p>
+            <w:pPr>
+              <w:pStyle w:stlname="Normal" w:val="Normal"/>
+            </w:pPr>
+            <w:r>
+              <w:t>3.84e-12</w:t>
             </w:r>
           </w:p>
         </w:tc>
@@ -296,37 +296,37 @@
               <w:pStyle w:stlname="Normal" w:val="Normal"/>
             </w:pPr>
             <w:r>
-              <w:t>78 (15.7%)</w:t>
-            </w:r>
-          </w:p>
-        </w:tc>
-        <w:tc>
-          <w:p>
-            <w:pPr>
-              <w:pStyle w:stlname="Normal" w:val="Normal"/>
-            </w:pPr>
-            <w:r>
-              <w:t>24 (18.6%)</w:t>
-            </w:r>
-          </w:p>
-        </w:tc>
-        <w:tc>
-          <w:p>
-            <w:pPr>
-              <w:pStyle w:stlname="Normal" w:val="Normal"/>
-            </w:pPr>
-            <w:r>
-              <w:t>5.13e-01</w:t>
-            </w:r>
-          </w:p>
-        </w:tc>
-        <w:tc>
-          <w:p>
-            <w:pPr>
-              <w:pStyle w:stlname="Normal" w:val="Normal"/>
-            </w:pPr>
-            <w:r>
-              <w:t>5.83e-01</w:t>
+              <w:t>77 (15.6%)</w:t>
+            </w:r>
+          </w:p>
+        </w:tc>
+        <w:tc>
+          <w:p>
+            <w:pPr>
+              <w:pStyle w:stlname="Normal" w:val="Normal"/>
+            </w:pPr>
+            <w:r>
+              <w:t>25 (19.2%)</w:t>
+            </w:r>
+          </w:p>
+        </w:tc>
+        <w:tc>
+          <w:p>
+            <w:pPr>
+              <w:pStyle w:stlname="Normal" w:val="Normal"/>
+            </w:pPr>
+            <w:r>
+              <w:t>3.81e-01</w:t>
+            </w:r>
+          </w:p>
+        </w:tc>
+        <w:tc>
+          <w:p>
+            <w:pPr>
+              <w:pStyle w:stlname="Normal" w:val="Normal"/>
+            </w:pPr>
+            <w:r>
+              <w:t>4.76e-01</w:t>
             </w:r>
           </w:p>
         </w:tc>
@@ -378,17 +378,17 @@
               <w:pStyle w:stlname="Normal" w:val="Normal"/>
             </w:pPr>
             <w:r>
-              <w:t>3.40e-02</w:t>
-            </w:r>
-          </w:p>
-        </w:tc>
-        <w:tc>
-          <w:p>
-            <w:pPr>
-              <w:pStyle w:stlname="Normal" w:val="Normal"/>
-            </w:pPr>
-            <w:r>
-              <w:t>1.04e-01</w:t>
+              <w:t>3.21e-02</w:t>
+            </w:r>
+          </w:p>
+        </w:tc>
+        <w:tc>
+          <w:p>
+            <w:pPr>
+              <w:pStyle w:stlname="Normal" w:val="Normal"/>
+            </w:pPr>
+            <w:r>
+              <w:t>1.07e-01</w:t>
             </w:r>
           </w:p>
         </w:tc>
@@ -440,17 +440,17 @@
               <w:pStyle w:stlname="Normal" w:val="Normal"/>
             </w:pPr>
             <w:r>
-              <w:t>1.29e-01</w:t>
-            </w:r>
-          </w:p>
-        </w:tc>
-        <w:tc>
-          <w:p>
-            <w:pPr>
-              <w:pStyle w:stlname="Normal" w:val="Normal"/>
-            </w:pPr>
-            <w:r>
-              <w:t>2.58e-01</w:t>
+              <w:t>1.36e-01</w:t>
+            </w:r>
+          </w:p>
+        </w:tc>
+        <w:tc>
+          <w:p>
+            <w:pPr>
+              <w:pStyle w:stlname="Normal" w:val="Normal"/>
+            </w:pPr>
+            <w:r>
+              <w:t>2.30e-01</w:t>
             </w:r>
           </w:p>
         </w:tc>
@@ -492,27 +492,27 @@
               <w:pStyle w:stlname="Normal" w:val="Normal"/>
             </w:pPr>
             <w:r>
-              <w:t>15 (11.6%)</w:t>
-            </w:r>
-          </w:p>
-        </w:tc>
-        <w:tc>
-          <w:p>
-            <w:pPr>
-              <w:pStyle w:stlname="Normal" w:val="Normal"/>
-            </w:pPr>
-            <w:r>
-              <w:t>5.25e-01</w:t>
-            </w:r>
-          </w:p>
-        </w:tc>
-        <w:tc>
-          <w:p>
-            <w:pPr>
-              <w:pStyle w:stlname="Normal" w:val="Normal"/>
-            </w:pPr>
-            <w:r>
-              <w:t>5.83e-01</w:t>
+              <w:t>15 (11.5%)</w:t>
+            </w:r>
+          </w:p>
+        </w:tc>
+        <w:tc>
+          <w:p>
+            <w:pPr>
+              <w:pStyle w:stlname="Normal" w:val="Normal"/>
+            </w:pPr>
+            <w:r>
+              <w:t>5.47e-01</w:t>
+            </w:r>
+          </w:p>
+        </w:tc>
+        <w:tc>
+          <w:p>
+            <w:pPr>
+              <w:pStyle w:stlname="Normal" w:val="Normal"/>
+            </w:pPr>
+            <w:r>
+              <w:t>6.08e-01</w:t>
             </w:r>
           </w:p>
         </w:tc>
@@ -554,27 +554,27 @@
               <w:pStyle w:stlname="Normal" w:val="Normal"/>
             </w:pPr>
             <w:r>
-              <w:t>5 (3.9%)</w:t>
-            </w:r>
-          </w:p>
-        </w:tc>
-        <w:tc>
-          <w:p>
-            <w:pPr>
-              <w:pStyle w:stlname="Normal" w:val="Normal"/>
-            </w:pPr>
-            <w:r>
-              <w:t>1.88e-01</w:t>
-            </w:r>
-          </w:p>
-        </w:tc>
-        <w:tc>
-          <w:p>
-            <w:pPr>
-              <w:pStyle w:stlname="Normal" w:val="Normal"/>
-            </w:pPr>
-            <w:r>
-              <w:t>3.13e-01</w:t>
+              <w:t>5 (3.8%)</w:t>
+            </w:r>
+          </w:p>
+        </w:tc>
+        <w:tc>
+          <w:p>
+            <w:pPr>
+              <w:pStyle w:stlname="Normal" w:val="Normal"/>
+            </w:pPr>
+            <w:r>
+              <w:t>1.80e-01</w:t>
+            </w:r>
+          </w:p>
+        </w:tc>
+        <w:tc>
+          <w:p>
+            <w:pPr>
+              <w:pStyle w:stlname="Normal" w:val="Normal"/>
+            </w:pPr>
+            <w:r>
+              <w:t>2.57e-01</w:t>
             </w:r>
           </w:p>
         </w:tc>
@@ -616,27 +616,27 @@
               <w:pStyle w:stlname="Normal" w:val="Normal"/>
             </w:pPr>
             <w:r>
-              <w:t>13 (10.1%)</w:t>
-            </w:r>
-          </w:p>
-        </w:tc>
-        <w:tc>
-          <w:p>
-            <w:pPr>
-              <w:pStyle w:stlname="Normal" w:val="Normal"/>
-            </w:pPr>
-            <w:r>
-              <w:t>4.17e-02</w:t>
-            </w:r>
-          </w:p>
-        </w:tc>
-        <w:tc>
-          <w:p>
-            <w:pPr>
-              <w:pStyle w:stlname="Normal" w:val="Normal"/>
-            </w:pPr>
-            <w:r>
-              <w:t>1.04e-01</w:t>
+              <w:t>13 (10.0%)</w:t>
+            </w:r>
+          </w:p>
+        </w:tc>
+        <w:tc>
+          <w:p>
+            <w:pPr>
+              <w:pStyle w:stlname="Normal" w:val="Normal"/>
+            </w:pPr>
+            <w:r>
+              <w:t>4.48e-02</w:t>
+            </w:r>
+          </w:p>
+        </w:tc>
+        <w:tc>
+          <w:p>
+            <w:pPr>
+              <w:pStyle w:stlname="Normal" w:val="Normal"/>
+            </w:pPr>
+            <w:r>
+              <w:t>1.12e-01</w:t>
             </w:r>
           </w:p>
         </w:tc>
@@ -668,7 +668,7 @@
               <w:pStyle w:stlname="Normal" w:val="Normal"/>
             </w:pPr>
             <w:r>
-              <w:t>26 (5.2%)</w:t>
+              <w:t>26 (5.3%)</w:t>
             </w:r>
           </w:p>
         </w:tc>
@@ -688,17 +688,17 @@
               <w:pStyle w:stlname="Normal" w:val="Normal"/>
             </w:pPr>
             <w:r>
-              <w:t>8.34e-01</w:t>
-            </w:r>
-          </w:p>
-        </w:tc>
-        <w:tc>
-          <w:p>
-            <w:pPr>
-              <w:pStyle w:stlname="Normal" w:val="Normal"/>
-            </w:pPr>
-            <w:r>
-              <w:t>8.34e-01</w:t>
+              <w:t>8.52e-01</w:t>
+            </w:r>
+          </w:p>
+        </w:tc>
+        <w:tc>
+          <w:p>
+            <w:pPr>
+              <w:pStyle w:stlname="Normal" w:val="Normal"/>
+            </w:pPr>
+            <w:r>
+              <w:t>8.52e-01</w:t>
             </w:r>
           </w:p>
         </w:tc>

</xml_diff>